<commit_message>
Đề cương: xuống dòng giống bản Google Docs, kiểm lại ngắt trang
- Bản trước để chế độ tương thích Word 2013, trong đó khoảng cách giữa các từ
  được co lại khi căn đều hai bên, nên nhiều dòng xuống dòng khác bản Google
  Docs (kể cả tên đề tài: "có điều / kiện"). Nay dùng chế độ Word 2010 (không
  co) và ghi lề ô thẳng vào bảng: khoảng 90% dòng trùng y hệt bản Google, phần
  còn lại là các chỗ đã sửa nội dung và tài liệu tham khảo ngắt ở dấu gạch nối.
- Chọn lại các hàng giữ trọn để tiêu đề không nằm một mình cuối trang; dòng
  cuối của mục "Các nghiên cứu liên quan" không còn bị đẩy một mình sang trang 3.
- Đã kiểm: chỉ nhúng Times New Roman và Arial (dấu "+"), không có ký tự thiếu
  phông, không chữ tràn khung hay chồng nhau, trích dẫn [1]–[16] theo thứ tự
  xuất hiện, nội dung chỉ khác bản 11/10 ở các chỗ sửa của Bước 1.

Co-Authored-By: Claude Opus 5.5 <noreply@anthropic.com>
Claude-Session: https://claude.ai/code/session_01XKRR9pxY1FMf1j4UJFC41W
</commit_message>
<xml_diff>
--- a/de_cuong/23521228_BuiLeHuyPhuoc_DeCuongKLTN_ban_cuoi.docx
+++ b/de_cuong/23521228_BuiLeHuyPhuoc_DeCuongKLTN_ban_cuoi.docx
@@ -419,6 +419,12 @@
           <w:insideV w:color="000000" w:space="0" w:sz="4" w:val="single"/>
         </w:tblBorders>
         <w:tblLayout w:type="fixed"/>
+        <w:tblCellMar>
+          <w:top w:w="0" w:type="dxa"/>
+          <w:left w:w="118" w:type="dxa"/>
+          <w:bottom w:w="0" w:type="dxa"/>
+          <w:right w:w="118" w:type="dxa"/>
+        </w:tblCellMar>
         <w:tblLook w:val="0000"/>
       </w:tblPr>
       <w:tblGrid>
@@ -958,7 +964,7 @@
           </w:tcPr>
           <w:p>
             <w:pPr>
-              <w:spacing w:after="80" w:line="276" w:lineRule="auto"/>
+              <w:spacing w:after="0" w:line="276" w:lineRule="auto"/>
               <w:ind w:right="102"/>
               <w:rPr>
                 <w:sz w:val="26"/>
@@ -1001,7 +1007,7 @@
           </w:tcPr>
           <w:p>
             <w:pPr>
-              <w:spacing w:after="240" w:before="240" w:line="276" w:lineRule="auto"/>
+              <w:spacing w:after="240" w:before="320" w:line="276" w:lineRule="auto"/>
               <w:rPr>
                 <w:sz w:val="26"/>
                 <w:szCs w:val="26"/>
@@ -1221,6 +1227,12 @@
                 <w:insideV w:color="000000" w:space="0" w:sz="4" w:val="single"/>
               </w:tblBorders>
               <w:tblLayout w:type="fixed"/>
+              <w:tblCellMar>
+                <w:top w:w="0" w:type="dxa"/>
+                <w:left w:w="115" w:type="dxa"/>
+                <w:bottom w:w="0" w:type="dxa"/>
+                <w:right w:w="115" w:type="dxa"/>
+              </w:tblCellMar>
               <w:tblLook w:val="0000"/>
             </w:tblPr>
             <w:tblGrid>
@@ -2369,7 +2381,7 @@
       </w:tr>
       <w:tr>
         <w:trPr>
-          <w:cantSplit w:val="1"/>
+          <w:cantSplit w:val="0"/>
           <w:tblHeader w:val="0"/>
         </w:trPr>
         <w:tc>
@@ -2710,7 +2722,7 @@
       </w:tr>
       <w:tr>
         <w:trPr>
-          <w:cantSplit w:val="1"/>
+          <w:cantSplit w:val="0"/>
           <w:tblHeader w:val="0"/>
         </w:trPr>
         <w:tc>
@@ -3119,7 +3131,7 @@
       </w:tr>
       <w:tr>
         <w:trPr>
-          <w:cantSplit w:val="0"/>
+          <w:cantSplit w:val="1"/>
           <w:tblHeader w:val="0"/>
         </w:trPr>
         <w:tc>
@@ -3156,7 +3168,7 @@
       </w:tr>
       <w:tr>
         <w:trPr>
-          <w:cantSplit w:val="1"/>
+          <w:cantSplit w:val="0"/>
           <w:tblHeader w:val="0"/>
         </w:trPr>
         <w:tc>
@@ -3399,7 +3411,7 @@
       </w:tr>
       <w:tr>
         <w:trPr>
-          <w:cantSplit w:val="0"/>
+          <w:cantSplit w:val="1"/>
           <w:tblHeader w:val="0"/>
         </w:trPr>
         <w:tc>
@@ -3695,7 +3707,7 @@
       </w:tr>
       <w:tr>
         <w:trPr>
-          <w:cantSplit w:val="0"/>
+          <w:cantSplit w:val="1"/>
           <w:tblHeader w:val="0"/>
         </w:trPr>
         <w:tc>
@@ -4373,7 +4385,7 @@
       </w:tr>
       <w:tr>
         <w:trPr>
-          <w:cantSplit w:val="1"/>
+          <w:cantSplit w:val="0"/>
           <w:tblHeader w:val="0"/>
         </w:trPr>
         <w:tc>
@@ -4423,6 +4435,12 @@
                 <w:insideV w:color="000000" w:space="0" w:sz="4" w:val="single"/>
               </w:tblBorders>
               <w:tblLayout w:type="fixed"/>
+              <w:tblCellMar>
+                <w:top w:w="0" w:type="dxa"/>
+                <w:left w:w="115" w:type="dxa"/>
+                <w:bottom w:w="0" w:type="dxa"/>
+                <w:right w:w="115" w:type="dxa"/>
+              </w:tblCellMar>
               <w:tblLook w:val="0000"/>
             </w:tblPr>
             <w:tblGrid>
@@ -5183,7 +5201,7 @@
       </w:tr>
       <w:tr>
         <w:trPr>
-          <w:cantSplit w:val="1"/>
+          <w:cantSplit w:val="0"/>
           <w:tblHeader w:val="0"/>
         </w:trPr>
         <w:tc>
@@ -5493,7 +5511,7 @@
       </w:tr>
       <w:tr>
         <w:trPr>
-          <w:cantSplit w:val="0"/>
+          <w:cantSplit w:val="1"/>
           <w:tblHeader w:val="0"/>
         </w:trPr>
         <w:tc>
@@ -5584,7 +5602,7 @@
       </w:tr>
       <w:tr>
         <w:trPr>
-          <w:cantSplit w:val="1"/>
+          <w:cantSplit w:val="0"/>
           <w:tblHeader w:val="0"/>
         </w:trPr>
         <w:tc>
@@ -5790,7 +5808,7 @@
       </w:tr>
       <w:tr>
         <w:trPr>
-          <w:cantSplit w:val="0"/>
+          <w:cantSplit w:val="1"/>
           <w:tblHeader w:val="0"/>
         </w:trPr>
         <w:tc>
@@ -6525,7 +6543,7 @@
       </w:tr>
       <w:tr>
         <w:trPr>
-          <w:cantSplit w:val="1"/>
+          <w:cantSplit w:val="0"/>
           <w:tblHeader w:val="0"/>
         </w:trPr>
         <w:tc>
@@ -6922,7 +6940,7 @@
       </w:tr>
       <w:tr>
         <w:trPr>
-          <w:cantSplit w:val="0"/>
+          <w:cantSplit w:val="1"/>
           <w:tblHeader w:val="0"/>
         </w:trPr>
         <w:tc>
@@ -7144,7 +7162,7 @@
       </w:tr>
       <w:tr>
         <w:trPr>
-          <w:cantSplit w:val="1"/>
+          <w:cantSplit w:val="0"/>
           <w:tblHeader w:val="0"/>
         </w:trPr>
         <w:tc>

</xml_diff>